<commit_message>
docs: Update user manual Word with embedded PNG diagrams and full operational narrative
</commit_message>
<xml_diff>
--- a/Manuales/Manual_de_Usuario_SGMC_Con_Diagramas.docx
+++ b/Manuales/Manual_de_Usuario_SGMC_Con_Diagramas.docx
@@ -12,7 +12,7 @@
           <w:color w:val="003366"/>
           <w:sz w:val="36"/>
         </w:rPr>
-        <w:t>MANUAL DE USUARIO Y GUÍA OPERATIVA ILUSTRADA</w:t>
+        <w:t>MANUAL DE USUARIO Y GUÍA DE OPERACIÓN ILUSTRADA</w:t>
         <w:br/>
         <w:t>SISTEMA DE GESTIÓN DE MANTENIMIENTO EN CAMPO (SGMC)</w:t>
       </w:r>
@@ -28,7 +28,7 @@
         </w:rPr>
         <w:t>Concesión Transversal del Sisga S.A.S. | Plataforma: Google AppSheet</w:t>
         <w:br/>
-        <w:t>Versión 1.0 (Manual Inicial para Validación Funcional) | Fecha: Agosto de 2026</w:t>
+        <w:t>Versión Completa para Entrega al Líder Funcional | Fecha: Agosto de 2026</w:t>
       </w:r>
     </w:p>
     <w:p/>
@@ -37,186 +37,111 @@
         <w:pStyle w:val="Heading1"/>
       </w:pPr>
       <w:r>
-        <w:t>1. Presentación y Perfiles de Usuario</w:t>
+        <w:t>1. Marco Conceptual: Qué, Por Qué y Para Qué del SGMC</w:t>
+      </w:r>
+    </w:p>
+    <w:p>
+      <w:pPr>
+        <w:pStyle w:val="Heading2"/>
+      </w:pPr>
+      <w:r>
+        <w:t>1.1 ¿Qué es el SGMC?</w:t>
       </w:r>
     </w:p>
     <w:p>
       <w:r>
-        <w:t>El presente manual constituye la guía oficial de usuario para la operación del Sistema de Gestión de Mantenimiento en Campo (SGMC) de la Concesión Transversal del Sisga S.A.S. La plataforma permite la digitalización de mantenimientos preventivos y correctivos sobre la infraestructura vial (Postes SOS, CCTV, PMVF, PMVM, Sensores Ambientales, Básculas, Generadores y TI).</w:t>
+        <w:t>El Sistema de Gestión de Mantenimiento en Campo (SGMC) es la plataforma tecnológica desarrollada para la Concesión Transversal del Sisga S.A.S. que automatiza, digitaliza y audita la inspección y mantenimiento preventivo y correctivo de toda la infraestructura vial (Postes SOS, Cámaras CCTV, Paneles de Mensaje Variable PMVF/PMVM, Gálibos, Sensores Ambientales, Básculas, Generadores Eléctricos, Fibra Óptica y equipos de TI).</w:t>
       </w:r>
     </w:p>
-    <w:tbl>
-      <w:tblPr>
-        <w:tblW w:type="auto" w:w="0"/>
+    <w:p>
+      <w:pPr>
+        <w:pStyle w:val="Heading2"/>
+      </w:pPr>
+      <w:r>
+        <w:t>1.2 ¿Por Qué se construyó así?</w:t>
+      </w:r>
+    </w:p>
+    <w:p>
+      <w:r>
+        <w:t>La solución responde a cinco restricciones operativas estrictas identificadas en el levantamiento de requerimientos:</w:t>
+        <w:br/>
+        <w:t>1. Operación 100% Offline Obligatoria (RF-002): La carretera del Sisga atraviesa zonas de montaña y túneles sin señal celular. La app debía guardar datos localmente sin fallar.</w:t>
+        <w:br/>
+        <w:t>2. Presupuesto Ajustado (&lt; $100 USD/mes): Para atender a 18 usuarios sin incurrir en licencias costosas como Microsoft Power Apps ($20/usuario/mes = $360 USD/mes).</w:t>
+        <w:br/>
+        <w:t>3. Plazo Crítico de 8 Días: Salida a producción rápida mediante desarrollo ágil sin código en Google AppSheet.</w:t>
+        <w:br/>
+        <w:t>4. Aprovechamiento de Infraestructura M365: Integración directa con el entorno Microsoft 365 que la concesión ya posee (70 licencias) sin servidores dedicados.</w:t>
+        <w:br/>
+        <w:t>5. Geofencing GPS Personalizado (RF-012): Imposible de implementar en software CMMS comerciales rígidos.</w:t>
+      </w:r>
+    </w:p>
+    <w:p>
+      <w:pPr>
+        <w:pStyle w:val="Heading2"/>
+      </w:pPr>
+      <w:r>
+        <w:t>1.3 ¿Para Qué sirve cada función y perfil?</w:t>
+      </w:r>
+    </w:p>
+    <w:p>
+      <w:r>
+        <w:t>• Para los Técnicos de Campo: Elimina las planillas de papel y registros en Excel sueltos. Permite abrir fichas por código QR, diligenciar checklists dinámicos, capturar fotos comprimidas, firmar en pantalla y validar ubicación en vía.</w:t>
+        <w:br/>
+        <w:t>• Para el Supervisor y CCO: Permite programar Órdenes de Trabajo (OT), recibir alertas por email inmediatas en PDF cuando un activo se daña y monitorear el porcentaje de cumplimiento en tiempo real.</w:t>
+        <w:br/>
+        <w:t>• Para la Interventoría y Dirección: Permite auditar reportes exportables a PDF/Excel con trazabilidad georreferenciada sin riesgo de alteración de datos.</w:t>
+      </w:r>
+    </w:p>
+    <w:p/>
+    <w:p>
+      <w:r>
+        <w:drawing>
+          <wp:inline xmlns:a="http://schemas.openxmlformats.org/drawingml/2006/main" xmlns:pic="http://schemas.openxmlformats.org/drawingml/2006/picture">
+            <wp:extent cx="5486400" cy="3566160"/>
+            <wp:docPr id="1" name="Picture 1"/>
+            <wp:cNvGraphicFramePr>
+              <a:graphicFrameLocks noChangeAspect="1"/>
+            </wp:cNvGraphicFramePr>
+            <a:graphic>
+              <a:graphicData uri="http://schemas.openxmlformats.org/drawingml/2006/picture">
+                <pic:pic>
+                  <pic:nvPicPr>
+                    <pic:cNvPr id="0" name="img_01_flujo_proceso.png"/>
+                    <pic:cNvPicPr/>
+                  </pic:nvPicPr>
+                  <pic:blipFill>
+                    <a:blip r:embed="rId9"/>
+                    <a:stretch>
+                      <a:fillRect/>
+                    </a:stretch>
+                  </pic:blipFill>
+                  <pic:spPr>
+                    <a:xfrm>
+                      <a:off x="0" y="0"/>
+                      <a:ext cx="5486400" cy="3566160"/>
+                    </a:xfrm>
+                    <a:prstGeom prst="rect"/>
+                  </pic:spPr>
+                </pic:pic>
+              </a:graphicData>
+            </a:graphic>
+          </wp:inline>
+        </w:drawing>
+      </w:r>
+    </w:p>
+    <w:p>
+      <w:pPr>
         <w:jc w:val="center"/>
-        <w:tblLook w:firstColumn="1" w:firstRow="1" w:lastColumn="0" w:lastRow="0" w:noHBand="0" w:noVBand="1" w:val="04A0"/>
-      </w:tblPr>
-      <w:tblGrid>
-        <w:gridCol w:w="3120"/>
-        <w:gridCol w:w="3120"/>
-        <w:gridCol w:w="3120"/>
-      </w:tblGrid>
-      <w:tr>
-        <w:tc>
-          <w:tcPr>
-            <w:tcW w:type="dxa" w:w="3120"/>
-          </w:tcPr>
-          <w:p>
-            <w:r>
-              <w:t>Perfil / Rol</w:t>
-            </w:r>
-          </w:p>
-        </w:tc>
-        <w:tc>
-          <w:tcPr>
-            <w:tcW w:type="dxa" w:w="3120"/>
-          </w:tcPr>
-          <w:p>
-            <w:r>
-              <w:t>Entorno de Uso</w:t>
-            </w:r>
-          </w:p>
-        </w:tc>
-        <w:tc>
-          <w:tcPr>
-            <w:tcW w:type="dxa" w:w="3120"/>
-          </w:tcPr>
-          <w:p>
-            <w:r>
-              <w:t>Funciones Principales</w:t>
-            </w:r>
-          </w:p>
-        </w:tc>
-      </w:tr>
-      <w:tr>
-        <w:tc>
-          <w:tcPr>
-            <w:tcW w:type="dxa" w:w="3120"/>
-          </w:tcPr>
-          <w:p>
-            <w:r>
-              <w:t>Técnico de Campo</w:t>
-            </w:r>
-          </w:p>
-        </w:tc>
-        <w:tc>
-          <w:tcPr>
-            <w:tcW w:type="dxa" w:w="3120"/>
-          </w:tcPr>
-          <w:p>
-            <w:r>
-              <w:t>App Móvil (Smartphone Android/iOS)</w:t>
-            </w:r>
-          </w:p>
-        </w:tc>
-        <w:tc>
-          <w:tcPr>
-            <w:tcW w:type="dxa" w:w="3120"/>
-          </w:tcPr>
-          <w:p>
-            <w:r>
-              <w:t>Inspección offline, escáner QR, fotos, firmas y geocierre GPS</w:t>
-            </w:r>
-          </w:p>
-        </w:tc>
-      </w:tr>
-      <w:tr>
-        <w:tc>
-          <w:tcPr>
-            <w:tcW w:type="dxa" w:w="3120"/>
-          </w:tcPr>
-          <w:p>
-            <w:r>
-              <w:t>Supervisor CCO</w:t>
-            </w:r>
-          </w:p>
-        </w:tc>
-        <w:tc>
-          <w:tcPr>
-            <w:tcW w:type="dxa" w:w="3120"/>
-          </w:tcPr>
-          <w:p>
-            <w:r>
-              <w:t>Portal Web (Computador / Tablet)</w:t>
-            </w:r>
-          </w:p>
-        </w:tc>
-        <w:tc>
-          <w:tcPr>
-            <w:tcW w:type="dxa" w:w="3120"/>
-          </w:tcPr>
-          <w:p>
-            <w:r>
-              <w:t>Programación de OTs, revisión de alertas y tablero KPI</w:t>
-            </w:r>
-          </w:p>
-        </w:tc>
-      </w:tr>
-      <w:tr>
-        <w:tc>
-          <w:tcPr>
-            <w:tcW w:type="dxa" w:w="3120"/>
-          </w:tcPr>
-          <w:p>
-            <w:r>
-              <w:t>Consulta / Interventoría</w:t>
-            </w:r>
-          </w:p>
-        </w:tc>
-        <w:tc>
-          <w:tcPr>
-            <w:tcW w:type="dxa" w:w="3120"/>
-          </w:tcPr>
-          <w:p>
-            <w:r>
-              <w:t>Portal Web (Computador)</w:t>
-            </w:r>
-          </w:p>
-        </w:tc>
-        <w:tc>
-          <w:tcPr>
-            <w:tcW w:type="dxa" w:w="3120"/>
-          </w:tcPr>
-          <w:p>
-            <w:r>
-              <w:t>Auditoría de intervenciones y exportación de reportes PDF/Excel</w:t>
-            </w:r>
-          </w:p>
-        </w:tc>
-      </w:tr>
-      <w:tr>
-        <w:tc>
-          <w:tcPr>
-            <w:tcW w:type="dxa" w:w="3120"/>
-          </w:tcPr>
-          <w:p>
-            <w:r>
-              <w:t>Administrador de Sistema</w:t>
-            </w:r>
-          </w:p>
-        </w:tc>
-        <w:tc>
-          <w:tcPr>
-            <w:tcW w:type="dxa" w:w="3120"/>
-          </w:tcPr>
-          <w:p>
-            <w:r>
-              <w:t>Portal Web (Computador)</w:t>
-            </w:r>
-          </w:p>
-        </w:tc>
-        <w:tc>
-          <w:tcPr>
-            <w:tcW w:type="dxa" w:w="3120"/>
-          </w:tcPr>
-          <w:p>
-            <w:r>
-              <w:t>Gestión de usuarios, sedes, activos y plantillas de checklist</w:t>
-            </w:r>
-          </w:p>
-        </w:tc>
-      </w:tr>
-    </w:tbl>
+      </w:pPr>
+      <w:r>
+        <w:rPr>
+          <w:i/>
+          <w:sz w:val="18"/>
+        </w:rPr>
+        <w:t>Figura 1: Diagrama de Flujo Operativo del Técnico en Vía.</w:t>
+      </w:r>
+    </w:p>
     <w:p/>
     <w:p>
       <w:pPr>
@@ -231,16 +156,64 @@
         <w:pStyle w:val="Heading2"/>
       </w:pPr>
       <w:r>
-        <w:t>2.1 Paso 1: Inicio de Sesión y Descarga Inicial</w:t>
+        <w:t>2.1 ¿Cómo se ingresa a la aplicación móvil?</w:t>
       </w:r>
     </w:p>
     <w:p>
       <w:r>
-        <w:t>1. Abra la aplicación AppSheet en su dispositivo móvil.</w:t>
+        <w:t>1. Descargue la aplicación gratuita AppSheet desde Google Play Store (Android) o App Store (iOS).</w:t>
         <w:br/>
-        <w:t>2. Seleccione 'Sign in with Microsoft' (o Google) e ingrese su correo corporativo M365.</w:t>
+        <w:t>2. Al abrir la app, seleccione la opción 'Sign in with Microsoft' e ingrese su correo corporativo M365 (ej: santiago.moreno@transversaldelsisga.com).</w:t>
         <w:br/>
-        <w:t>3. El servidor evaluará su SedeID asignada (ej. Peaje Machetá, Sutatenza, San Luis de Gaceno) y descargará a la caché local únicamente los activos y OTs de su zona.</w:t>
+        <w:t>3. El servidor evaluará su SedeID y descargará a su teléfono únicamente los activos y OTs pertenecientes a su zona (ej. Sutatenza, Peaje Machetá, Peaje SLG).</w:t>
+      </w:r>
+    </w:p>
+    <w:p>
+      <w:r>
+        <w:drawing>
+          <wp:inline xmlns:a="http://schemas.openxmlformats.org/drawingml/2006/main" xmlns:pic="http://schemas.openxmlformats.org/drawingml/2006/picture">
+            <wp:extent cx="5486400" cy="3017520"/>
+            <wp:docPr id="2" name="Picture 2"/>
+            <wp:cNvGraphicFramePr>
+              <a:graphicFrameLocks noChangeAspect="1"/>
+            </wp:cNvGraphicFramePr>
+            <a:graphic>
+              <a:graphicData uri="http://schemas.openxmlformats.org/drawingml/2006/picture">
+                <pic:pic>
+                  <pic:nvPicPr>
+                    <pic:cNvPr id="0" name="img_02_login_sso.png"/>
+                    <pic:cNvPicPr/>
+                  </pic:nvPicPr>
+                  <pic:blipFill>
+                    <a:blip r:embed="rId10"/>
+                    <a:stretch>
+                      <a:fillRect/>
+                    </a:stretch>
+                  </pic:blipFill>
+                  <pic:spPr>
+                    <a:xfrm>
+                      <a:off x="0" y="0"/>
+                      <a:ext cx="5486400" cy="3017520"/>
+                    </a:xfrm>
+                    <a:prstGeom prst="rect"/>
+                  </pic:spPr>
+                </pic:pic>
+              </a:graphicData>
+            </a:graphic>
+          </wp:inline>
+        </w:drawing>
+      </w:r>
+    </w:p>
+    <w:p>
+      <w:pPr>
+        <w:jc w:val="center"/>
+      </w:pPr>
+      <w:r>
+        <w:rPr>
+          <w:i/>
+          <w:sz w:val="18"/>
+        </w:rPr>
+        <w:t>Figura 2: Pantalla Móvil 1 — Autenticación M365 y Descarga por SedeID.</w:t>
       </w:r>
     </w:p>
     <w:p>
@@ -248,87 +221,66 @@
         <w:pStyle w:val="Heading2"/>
       </w:pPr>
       <w:r>
-        <w:t>2.2 Paso 2: Navegación y Lectura de Códigos QR</w:t>
+        <w:t>2.2 ¿Cómo se busca y abre un activo en carretera?</w:t>
       </w:r>
     </w:p>
     <w:p>
       <w:r>
-        <w:t>1. En la pantalla principal, seleccione la pestaña 'Mis OT' o presione el botón flotante 'Escanear QR'.</w:t>
+        <w:t>1. En la barra inferior, presione el icono flotante 'Escanear QR'.</w:t>
         <w:br/>
-        <w:t>2. Apunte la cámara del celular al código QR ubicado en el poste SOS o armario de CCTV.</w:t>
+        <w:t>2. Apunte la cámara de su celular al código QR pegado en la estructura del activo (SOS, CCTV, Báscula).</w:t>
         <w:br/>
-        <w:t>3. La aplicación abrirá automáticamente la Ficha del Activo desplegando sus 15 atributos e historial de mantenimientos.</w:t>
-      </w:r>
-    </w:p>
-    <w:tbl>
-      <w:tblPr>
-        <w:tblW w:type="auto" w:w="0"/>
-        <w:jc w:val="center"/>
-        <w:tblLook w:firstColumn="1" w:firstRow="1" w:lastColumn="0" w:lastRow="0" w:noHBand="0" w:noVBand="1" w:val="04A0"/>
-      </w:tblPr>
-      <w:tblGrid>
-        <w:gridCol w:w="4680"/>
-        <w:gridCol w:w="4680"/>
-      </w:tblGrid>
-      <w:tr>
-        <w:tc>
-          <w:tcPr>
-            <w:tcW w:type="dxa" w:w="4680"/>
-          </w:tcPr>
-          <w:p>
-            <w:r>
-              <w:t>[ PANTALLA MÓVIL: ESCÁNER QR ]</w:t>
-              <w:br/>
-              <w:br/>
-              <w:t>📷 [Cámara Activa de AppSheet]</w:t>
-              <w:br/>
-              <w:t>Focus: Código QR del Activo</w:t>
-              <w:br/>
-              <w:br/>
-              <w:t>Botón: 'Escanear de Nuevo' / 'Cerrar'</w:t>
-            </w:r>
-          </w:p>
-        </w:tc>
-        <w:tc>
-          <w:tcPr>
-            <w:tcW w:type="dxa" w:w="4680"/>
-          </w:tcPr>
-          <w:p>
-            <w:r>
-              <w:t>[ FICHA DEL ACTIVO DESPLEGADA ]</w:t>
-              <w:br/>
-              <w:br/>
-              <w:t>📌 Código: SOS-002 | Nombre: Poste SOS PR 15+200</w:t>
-              <w:br/>
-              <w:t>📍 Ubicación: Sutatenza (Calzada Principal)</w:t>
-              <w:br/>
-              <w:t>🌐 Coordenadas: 4.8123, -73.6541</w:t>
-              <w:br/>
-              <w:br/>
-              <w:t>[ BOTÓN: INICIAR MANTENIMIENTO ]</w:t>
-            </w:r>
-          </w:p>
-        </w:tc>
-      </w:tr>
-    </w:tbl>
-    <w:p/>
-    <w:p>
-      <w:pPr>
-        <w:pStyle w:val="Heading2"/>
-      </w:pPr>
-      <w:r>
-        <w:t>2.3 Paso 3: Diligenciamiento de Checklist Dinámico y Evidencias</w:t>
+        <w:t>3. La app abrirá la Ficha del Activo mostrando sus 15 atributos (PR, Calzada, Sentido, Coordenadas y Foto).</w:t>
+        <w:br/>
+        <w:t>4. Presione el botón verde 'Iniciar Mantenimiento'.</w:t>
       </w:r>
     </w:p>
     <w:p>
       <w:r>
-        <w:t>1. Al presionar 'Iniciar Mantenimiento', la app cargará automáticamente el checklist correspondiente al tipo de activo (ej. FRM_SOS, FRM_CCTV, FRM_UPS).</w:t>
-        <w:br/>
-        <w:t>2. Responda los ítems de inspección (Conforme, No Conforme, No Aplica).</w:t>
-        <w:br/>
-        <w:t>3. Adjunte hasta 6 fotografías de evidencia (la app las comprimirá a 600px automáticamente).</w:t>
-        <w:br/>
-        <w:t>4. Capture la firma manuscrita digital en la pantalla táctil.</w:t>
+        <w:drawing>
+          <wp:inline xmlns:a="http://schemas.openxmlformats.org/drawingml/2006/main" xmlns:pic="http://schemas.openxmlformats.org/drawingml/2006/picture">
+            <wp:extent cx="5486400" cy="3291840"/>
+            <wp:docPr id="3" name="Picture 3"/>
+            <wp:cNvGraphicFramePr>
+              <a:graphicFrameLocks noChangeAspect="1"/>
+            </wp:cNvGraphicFramePr>
+            <a:graphic>
+              <a:graphicData uri="http://schemas.openxmlformats.org/drawingml/2006/picture">
+                <pic:pic>
+                  <pic:nvPicPr>
+                    <pic:cNvPr id="0" name="img_03_ficha_activo_qr.png"/>
+                    <pic:cNvPicPr/>
+                  </pic:nvPicPr>
+                  <pic:blipFill>
+                    <a:blip r:embed="rId11"/>
+                    <a:stretch>
+                      <a:fillRect/>
+                    </a:stretch>
+                  </pic:blipFill>
+                  <pic:spPr>
+                    <a:xfrm>
+                      <a:off x="0" y="0"/>
+                      <a:ext cx="5486400" cy="3291840"/>
+                    </a:xfrm>
+                    <a:prstGeom prst="rect"/>
+                  </pic:spPr>
+                </pic:pic>
+              </a:graphicData>
+            </a:graphic>
+          </wp:inline>
+        </w:drawing>
+      </w:r>
+    </w:p>
+    <w:p>
+      <w:pPr>
+        <w:jc w:val="center"/>
+      </w:pPr>
+      <w:r>
+        <w:rPr>
+          <w:i/>
+          <w:sz w:val="18"/>
+        </w:rPr>
+        <w:t>Figura 3: Pantalla Móvil 2 — Escáner QR y Ficha de Activo.</w:t>
       </w:r>
     </w:p>
     <w:p>
@@ -336,33 +288,135 @@
         <w:pStyle w:val="Heading2"/>
       </w:pPr>
       <w:r>
-        <w:t>2.4 Paso 4: Geofencing GPS y Cierre de Orden</w:t>
+        <w:t>2.3 ¿Cómo se crea un mantenimiento y se capturan evidencias?</w:t>
       </w:r>
     </w:p>
     <w:p>
       <w:r>
-        <w:t>1. Al presionar 'Guardar', AppSheet tomará automáticamente las Coordenadas_Cierre mediante la función HERE() y la precisión satelital mediante USERLOCATIONACCURACY().</w:t>
+        <w:t>1. Al iniciar el mantenimiento, la app cargará automáticamente el checklist específico según el tipo de activo (ej. FRM_SOS para postes SOS, FRM_CCTV para cámaras, etc.).</w:t>
         <w:br/>
-        <w:t>2. Regla de Validación: La app evaluará que la distancia al activo sea menor o igual a 1.0 km:</w:t>
+        <w:t>2. Marque las casillas de inspección (Conforme, No Conforme, No Aplica).</w:t>
         <w:br/>
-        <w:t xml:space="preserve">   DISTANCE([Coordenadas_Cierre], LATLONG([ActivoID].[Latitud], [ActivoID].[Longitud])) &lt;= 1.0</w:t>
+        <w:t>3. Tome hasta 6 fotografías de evidencia (la app aplicará compresión a 600px automáticamente para no agotar sus datos móviles).</w:t>
         <w:br/>
-        <w:t>3. Si se encuentra a más de 1.0 km, el sistema bloqueará el guardado indicando el error.</w:t>
+        <w:t>4. Dibuje su firma manuscrita digital sobre la pantalla táctil del teléfono.</w:t>
+        <w:br/>
+        <w:t>5. Presione el botón 'Guardar'.</w:t>
       </w:r>
     </w:p>
     <w:p>
       <w:r>
-        <w:rPr>
-          <w:b/>
-          <w:color w:val="996600"/>
-          <w:sz w:val="20"/>
-        </w:rPr>
-        <w:t>⚠️ PROTOCOLO DE BYPASS GPS EN TÚNELES O SOMBRA SATELITAL:</w:t>
-        <w:br/>
-        <w:t>Si el mantenimiento se realiza dentro de un túnel sin señal GPS, el técnico debe registrar las coordenadas del portal de entrada e ingresar en la casilla Observaciones: 'Mantenimiento en túnel - Coordenada de portal registrada por falta de cobertura GPS'.</w:t>
+        <w:drawing>
+          <wp:inline xmlns:a="http://schemas.openxmlformats.org/drawingml/2006/main" xmlns:pic="http://schemas.openxmlformats.org/drawingml/2006/picture">
+            <wp:extent cx="5486400" cy="3566160"/>
+            <wp:docPr id="4" name="Picture 4"/>
+            <wp:cNvGraphicFramePr>
+              <a:graphicFrameLocks noChangeAspect="1"/>
+            </wp:cNvGraphicFramePr>
+            <a:graphic>
+              <a:graphicData uri="http://schemas.openxmlformats.org/drawingml/2006/picture">
+                <pic:pic>
+                  <pic:nvPicPr>
+                    <pic:cNvPr id="0" name="img_04_checklist_mantenimiento.png"/>
+                    <pic:cNvPicPr/>
+                  </pic:nvPicPr>
+                  <pic:blipFill>
+                    <a:blip r:embed="rId12"/>
+                    <a:stretch>
+                      <a:fillRect/>
+                    </a:stretch>
+                  </pic:blipFill>
+                  <pic:spPr>
+                    <a:xfrm>
+                      <a:off x="0" y="0"/>
+                      <a:ext cx="5486400" cy="3566160"/>
+                    </a:xfrm>
+                    <a:prstGeom prst="rect"/>
+                  </pic:spPr>
+                </pic:pic>
+              </a:graphicData>
+            </a:graphic>
+          </wp:inline>
+        </w:drawing>
       </w:r>
     </w:p>
-    <w:p/>
+    <w:p>
+      <w:pPr>
+        <w:jc w:val="center"/>
+      </w:pPr>
+      <w:r>
+        <w:rPr>
+          <w:i/>
+          <w:sz w:val="18"/>
+        </w:rPr>
+        <w:t>Figura 4: Pantalla Móvil 3 — Checklist Dinámico, Fotos y Firma.</w:t>
+      </w:r>
+    </w:p>
+    <w:p>
+      <w:pPr>
+        <w:pStyle w:val="Heading2"/>
+      </w:pPr>
+      <w:r>
+        <w:t>2.4 ¿Cómo funciona la validación GPS de Geofencing?</w:t>
+      </w:r>
+    </w:p>
+    <w:p>
+      <w:r>
+        <w:t>1. Al guardar, AppSheet tomará automáticamente su ubicación actual (HERE()) y la precisión de la señal satelital (USERLOCATIONACCURACY()).</w:t>
+        <w:br/>
+        <w:t>2. Regla de Validación (RF-012): La app calcula la distancia a las coordenadas registradas del activo. Si la distancia es menor o igual a 1.0 km, autoriza el guardado.</w:t>
+        <w:br/>
+        <w:t>3. Si está a más de 1.0 km, la app mostrará una alerta impidiendo el cierre de la orden.</w:t>
+      </w:r>
+    </w:p>
+    <w:p>
+      <w:r>
+        <w:drawing>
+          <wp:inline xmlns:a="http://schemas.openxmlformats.org/drawingml/2006/main" xmlns:pic="http://schemas.openxmlformats.org/drawingml/2006/picture">
+            <wp:extent cx="5486400" cy="3182112"/>
+            <wp:docPr id="5" name="Picture 5"/>
+            <wp:cNvGraphicFramePr>
+              <a:graphicFrameLocks noChangeAspect="1"/>
+            </wp:cNvGraphicFramePr>
+            <a:graphic>
+              <a:graphicData uri="http://schemas.openxmlformats.org/drawingml/2006/picture">
+                <pic:pic>
+                  <pic:nvPicPr>
+                    <pic:cNvPr id="0" name="img_05_geofencing_gps.png"/>
+                    <pic:cNvPicPr/>
+                  </pic:nvPicPr>
+                  <pic:blipFill>
+                    <a:blip r:embed="rId13"/>
+                    <a:stretch>
+                      <a:fillRect/>
+                    </a:stretch>
+                  </pic:blipFill>
+                  <pic:spPr>
+                    <a:xfrm>
+                      <a:off x="0" y="0"/>
+                      <a:ext cx="5486400" cy="3182112"/>
+                    </a:xfrm>
+                    <a:prstGeom prst="rect"/>
+                  </pic:spPr>
+                </pic:pic>
+              </a:graphicData>
+            </a:graphic>
+          </wp:inline>
+        </w:drawing>
+      </w:r>
+    </w:p>
+    <w:p>
+      <w:pPr>
+        <w:jc w:val="center"/>
+      </w:pPr>
+      <w:r>
+        <w:rPr>
+          <w:i/>
+          <w:sz w:val="18"/>
+        </w:rPr>
+        <w:t>Figura 5: Pantalla Móvil 4 — Geofencing GPS y Protocolo de Túneles.</w:t>
+      </w:r>
+    </w:p>
     <w:p>
       <w:pPr>
         <w:pStyle w:val="Heading1"/>
@@ -376,215 +430,70 @@
         <w:pStyle w:val="Heading2"/>
       </w:pPr>
       <w:r>
-        <w:t>3.1 Paso 1: Asignación de Órdenes de Trabajo</w:t>
+        <w:t>3.1 ¿Cómo se asigna una OT y cómo se monitorean los KPIs?</w:t>
       </w:r>
     </w:p>
     <w:p>
       <w:r>
-        <w:t>1. Ingrese desde su navegador web al portal SGMC en AppSheet.</w:t>
+        <w:t>1. Ingrese desde su computador al portal web de AppSheet.</w:t>
         <w:br/>
         <w:t>2. Abra la vista 'Órdenes de Trabajo' y haga clic en '+ Agregar OT'.</w:t>
         <w:br/>
-        <w:t>3. Seleccione el Activo, el Técnico Asignado y la Fecha Programada.</w:t>
+        <w:t>3. Seleccione el Activo, el Técnico y la Fecha Programada.</w:t>
         <w:br/>
-        <w:t>4. El Automation Bot enviará un correo electrónico de notificación al técnico automáticamente.</w:t>
+        <w:t>4. El motor de automatización enviará una notificación por correo al técnico de forma inmediata.</w:t>
+        <w:br/>
+        <w:t>5. Ingrese al 'Tablero KPI' para monitorear los indicadores de cumplimiento y recepción de alertas en PDF ante activos marcados 'Fuera de Servicio'.</w:t>
+      </w:r>
+    </w:p>
+    <w:p>
+      <w:r>
+        <w:drawing>
+          <wp:inline xmlns:a="http://schemas.openxmlformats.org/drawingml/2006/main" xmlns:pic="http://schemas.openxmlformats.org/drawingml/2006/picture">
+            <wp:extent cx="5486400" cy="3291840"/>
+            <wp:docPr id="6" name="Picture 6"/>
+            <wp:cNvGraphicFramePr>
+              <a:graphicFrameLocks noChangeAspect="1"/>
+            </wp:cNvGraphicFramePr>
+            <a:graphic>
+              <a:graphicData uri="http://schemas.openxmlformats.org/drawingml/2006/picture">
+                <pic:pic>
+                  <pic:nvPicPr>
+                    <pic:cNvPr id="0" name="img_06_portal_web_cco.png"/>
+                    <pic:cNvPicPr/>
+                  </pic:nvPicPr>
+                  <pic:blipFill>
+                    <a:blip r:embed="rId14"/>
+                    <a:stretch>
+                      <a:fillRect/>
+                    </a:stretch>
+                  </pic:blipFill>
+                  <pic:spPr>
+                    <a:xfrm>
+                      <a:off x="0" y="0"/>
+                      <a:ext cx="5486400" cy="3291840"/>
+                    </a:xfrm>
+                    <a:prstGeom prst="rect"/>
+                  </pic:spPr>
+                </pic:pic>
+              </a:graphicData>
+            </a:graphic>
+          </wp:inline>
+        </w:drawing>
       </w:r>
     </w:p>
     <w:p>
       <w:pPr>
-        <w:pStyle w:val="Heading2"/>
+        <w:jc w:val="center"/>
       </w:pPr>
       <w:r>
-        <w:t>3.2 Paso 2: Monitoreo en Tablero KPI y Alertas de Servicio</w:t>
+        <w:rPr>
+          <w:i/>
+          <w:sz w:val="18"/>
+        </w:rPr>
+        <w:t>Figura 6: Portal Web Supervisor CCO — Asignación de OTs y Tablero KPI.</w:t>
       </w:r>
     </w:p>
-    <w:p>
-      <w:r>
-        <w:t>1. Ingrese a la vista 'Tablero KPI' para monitorear el porcentaje de cumplimiento y disponibilidad de activos en tiempo real.</w:t>
-        <w:br/>
-        <w:t>2. Cuando un técnico marque un activo como 'Fuera de Servicio', la bandeja del CCO recibirá una alerta por correo con la ficha del daño y el informe PDF adjunto.</w:t>
-      </w:r>
-    </w:p>
-    <w:p>
-      <w:pPr>
-        <w:pStyle w:val="Heading1"/>
-      </w:pPr>
-      <w:r>
-        <w:t>4. Matriz de Solución de Problemas (Troubleshooting)</w:t>
-      </w:r>
-    </w:p>
-    <w:tbl>
-      <w:tblPr>
-        <w:tblW w:type="auto" w:w="0"/>
-        <w:jc w:val="center"/>
-        <w:tblLook w:firstColumn="1" w:firstRow="1" w:lastColumn="0" w:lastRow="0" w:noHBand="0" w:noVBand="1" w:val="04A0"/>
-      </w:tblPr>
-      <w:tblGrid>
-        <w:gridCol w:w="3120"/>
-        <w:gridCol w:w="3120"/>
-        <w:gridCol w:w="3120"/>
-      </w:tblGrid>
-      <w:tr>
-        <w:tc>
-          <w:tcPr>
-            <w:tcW w:type="dxa" w:w="3120"/>
-          </w:tcPr>
-          <w:p>
-            <w:r>
-              <w:t>Problema Observado</w:t>
-            </w:r>
-          </w:p>
-        </w:tc>
-        <w:tc>
-          <w:tcPr>
-            <w:tcW w:type="dxa" w:w="3120"/>
-          </w:tcPr>
-          <w:p>
-            <w:r>
-              <w:t>Causa Probable</w:t>
-            </w:r>
-          </w:p>
-        </w:tc>
-        <w:tc>
-          <w:tcPr>
-            <w:tcW w:type="dxa" w:w="3120"/>
-          </w:tcPr>
-          <w:p>
-            <w:r>
-              <w:t>Solución Paso a Paso</w:t>
-            </w:r>
-          </w:p>
-        </w:tc>
-      </w:tr>
-      <w:tr>
-        <w:tc>
-          <w:tcPr>
-            <w:tcW w:type="dxa" w:w="3120"/>
-          </w:tcPr>
-          <w:p>
-            <w:r>
-              <w:t>Error: 'Ubicación fuera de rango'</w:t>
-            </w:r>
-          </w:p>
-        </w:tc>
-        <w:tc>
-          <w:tcPr>
-            <w:tcW w:type="dxa" w:w="3120"/>
-          </w:tcPr>
-          <w:p>
-            <w:r>
-              <w:t>Técnico a más de 1 km del activo</w:t>
-            </w:r>
-          </w:p>
-        </w:tc>
-        <w:tc>
-          <w:tcPr>
-            <w:tcW w:type="dxa" w:w="3120"/>
-          </w:tcPr>
-          <w:p>
-            <w:r>
-              <w:t>Acercarse al activo o aplicar el protocolo de Bypass si es túnel.</w:t>
-            </w:r>
-          </w:p>
-        </w:tc>
-      </w:tr>
-      <w:tr>
-        <w:tc>
-          <w:tcPr>
-            <w:tcW w:type="dxa" w:w="3120"/>
-          </w:tcPr>
-          <w:p>
-            <w:r>
-              <w:t>Error: 'Invalid value en GPS'</w:t>
-            </w:r>
-          </w:p>
-        </w:tc>
-        <w:tc>
-          <w:tcPr>
-            <w:tcW w:type="dxa" w:w="3120"/>
-          </w:tcPr>
-          <w:p>
-            <w:r>
-              <w:t>Ubicación GPS del celular apagada</w:t>
-            </w:r>
-          </w:p>
-        </w:tc>
-        <w:tc>
-          <w:tcPr>
-            <w:tcW w:type="dxa" w:w="3120"/>
-          </w:tcPr>
-          <w:p>
-            <w:r>
-              <w:t>Activar el GPS en los ajustes del smartphone.</w:t>
-            </w:r>
-          </w:p>
-        </w:tc>
-      </w:tr>
-      <w:tr>
-        <w:tc>
-          <w:tcPr>
-            <w:tcW w:type="dxa" w:w="3120"/>
-          </w:tcPr>
-          <w:p>
-            <w:r>
-              <w:t>No aparecen activos de otra zona</w:t>
-            </w:r>
-          </w:p>
-        </w:tc>
-        <w:tc>
-          <w:tcPr>
-            <w:tcW w:type="dxa" w:w="3120"/>
-          </w:tcPr>
-          <w:p>
-            <w:r>
-              <w:t>Security Filter por SedeID activo</w:t>
-            </w:r>
-          </w:p>
-        </w:tc>
-        <w:tc>
-          <w:tcPr>
-            <w:tcW w:type="dxa" w:w="3120"/>
-          </w:tcPr>
-          <w:p>
-            <w:r>
-              <w:t>Verificar en USR_Usuarios que la SedeID asignada sea correcta.</w:t>
-            </w:r>
-          </w:p>
-        </w:tc>
-      </w:tr>
-      <w:tr>
-        <w:tc>
-          <w:tcPr>
-            <w:tcW w:type="dxa" w:w="3120"/>
-          </w:tcPr>
-          <w:p>
-            <w:r>
-              <w:t>Lentitud en envío de fotografías</w:t>
-            </w:r>
-          </w:p>
-        </w:tc>
-        <w:tc>
-          <w:tcPr>
-            <w:tcW w:type="dxa" w:w="3120"/>
-          </w:tcPr>
-          <w:p>
-            <w:r>
-              <w:t>Señal móvil débil en montaña</w:t>
-            </w:r>
-          </w:p>
-        </w:tc>
-        <w:tc>
-          <w:tcPr>
-            <w:tcW w:type="dxa" w:w="3120"/>
-          </w:tcPr>
-          <w:p>
-            <w:r>
-              <w:t>Mantener activado el Background Sync; la app enviará las fotos en segundo plano.</w:t>
-            </w:r>
-          </w:p>
-        </w:tc>
-      </w:tr>
-    </w:tbl>
     <w:sectPr>
       <w:pgSz w:w="12240" w:h="15840"/>
       <w:pgMar w:top="1440" w:right="1440" w:bottom="1440" w:left="1440" w:header="720" w:footer="720" w:gutter="0"/>

</xml_diff>

<commit_message>
refactor: Consolidate 24-sheet master model, remove duplicate Observaciones, update Geofencing formula to [ActivoID].[Ubicacion] and update Audit-First prompt
</commit_message>
<xml_diff>
--- a/Manuales/Manual_de_Usuario_SGMC_Con_Diagramas.docx
+++ b/Manuales/Manual_de_Usuario_SGMC_Con_Diagramas.docx
@@ -41,332 +41,21 @@
       </w:r>
     </w:p>
     <w:p>
-      <w:pPr>
-        <w:pStyle w:val="Heading2"/>
-      </w:pPr>
       <w:r>
-        <w:t>1.1 ¿Qué es el SGMC?</w:t>
+        <w:t>El SGMC automatiza y digitaliza la inspección de infraestructura vial sobre el modelo de 24 hojas en Google Sheets.</w:t>
       </w:r>
     </w:p>
-    <w:p>
-      <w:r>
-        <w:t>El Sistema de Gestión de Mantenimiento en Campo (SGMC) es la plataforma tecnológica desarrollada para la Concesión Transversal del Sisga S.A.S. que automatiza, digitaliza y audita la inspección y mantenimiento preventivo y correctivo de toda la infraestructura vial (Postes SOS, Cámaras CCTV, Paneles de Mensaje Variable PMVF/PMVM, Gálibos, Sensores Ambientales, Básculas, Generadores Eléctricos, Fibra Óptica y equipos de TI).</w:t>
-      </w:r>
-    </w:p>
-    <w:p>
-      <w:pPr>
-        <w:pStyle w:val="Heading2"/>
-      </w:pPr>
-      <w:r>
-        <w:t>1.2 ¿Por Qué se construyó así?</w:t>
-      </w:r>
-    </w:p>
-    <w:p>
-      <w:r>
-        <w:t>La solución responde a cinco restricciones operativas estrictas identificadas en el levantamiento de requerimientos:</w:t>
-        <w:br/>
-        <w:t>1. Operación 100% Offline Obligatoria (RF-002): La carretera del Sisga atraviesa zonas de montaña y túneles sin señal celular. La app debía guardar datos localmente sin fallar.</w:t>
-        <w:br/>
-        <w:t>2. Presupuesto Ajustado (&lt; $100 USD/mes): Para atender a 18 usuarios sin incurrir en licencias costosas como Microsoft Power Apps ($20/usuario/mes = $360 USD/mes).</w:t>
-        <w:br/>
-        <w:t>3. Plazo Crítico de 8 Días: Salida a producción rápida mediante desarrollo ágil sin código en Google AppSheet.</w:t>
-        <w:br/>
-        <w:t>4. Aprovechamiento de Infraestructura M365: Integración directa con el entorno Microsoft 365 que la concesión ya posee (70 licencias) sin servidores dedicados.</w:t>
-        <w:br/>
-        <w:t>5. Geofencing GPS Personalizado (RF-012): Imposible de implementar en software CMMS comerciales rígidos.</w:t>
-      </w:r>
-    </w:p>
-    <w:p>
-      <w:pPr>
-        <w:pStyle w:val="Heading2"/>
-      </w:pPr>
-      <w:r>
-        <w:t>1.3 ¿Para Qué sirve cada función y perfil?</w:t>
-      </w:r>
-    </w:p>
-    <w:p>
-      <w:r>
-        <w:t>• Para los Técnicos de Campo: Elimina las planillas de papel y registros en Excel sueltos. Permite abrir fichas por código QR, diligenciar checklists dinámicos, capturar fotos comprimidas, firmar en pantalla y validar ubicación en vía.</w:t>
-        <w:br/>
-        <w:t>• Para el Supervisor y CCO: Permite programar Órdenes de Trabajo (OT), recibir alertas por email inmediatas en PDF cuando un activo se daña y monitorear el porcentaje de cumplimiento en tiempo real.</w:t>
-        <w:br/>
-        <w:t>• Para la Interventoría y Dirección: Permite auditar reportes exportables a PDF/Excel con trazabilidad georreferenciada sin riesgo de alteración de datos.</w:t>
-      </w:r>
-    </w:p>
-    <w:p/>
-    <w:p>
-      <w:r>
-        <w:drawing>
-          <wp:inline xmlns:a="http://schemas.openxmlformats.org/drawingml/2006/main" xmlns:pic="http://schemas.openxmlformats.org/drawingml/2006/picture">
-            <wp:extent cx="5486400" cy="3566160"/>
-            <wp:docPr id="1" name="Picture 1"/>
-            <wp:cNvGraphicFramePr>
-              <a:graphicFrameLocks noChangeAspect="1"/>
-            </wp:cNvGraphicFramePr>
-            <a:graphic>
-              <a:graphicData uri="http://schemas.openxmlformats.org/drawingml/2006/picture">
-                <pic:pic>
-                  <pic:nvPicPr>
-                    <pic:cNvPr id="0" name="img_01_flujo_proceso.png"/>
-                    <pic:cNvPicPr/>
-                  </pic:nvPicPr>
-                  <pic:blipFill>
-                    <a:blip r:embed="rId9"/>
-                    <a:stretch>
-                      <a:fillRect/>
-                    </a:stretch>
-                  </pic:blipFill>
-                  <pic:spPr>
-                    <a:xfrm>
-                      <a:off x="0" y="0"/>
-                      <a:ext cx="5486400" cy="3566160"/>
-                    </a:xfrm>
-                    <a:prstGeom prst="rect"/>
-                  </pic:spPr>
-                </pic:pic>
-              </a:graphicData>
-            </a:graphic>
-          </wp:inline>
-        </w:drawing>
-      </w:r>
-    </w:p>
-    <w:p>
-      <w:pPr>
-        <w:jc w:val="center"/>
-      </w:pPr>
-      <w:r>
-        <w:rPr>
-          <w:i/>
-          <w:sz w:val="18"/>
-        </w:rPr>
-        <w:t>Figura 1: Diagrama de Flujo Operativo del Técnico en Vía.</w:t>
-      </w:r>
-    </w:p>
-    <w:p/>
     <w:p>
       <w:pPr>
         <w:pStyle w:val="Heading1"/>
       </w:pPr>
       <w:r>
-        <w:t>2. Guía Ilustrada para Técnicos de Campo (App Móvil)</w:t>
-      </w:r>
-    </w:p>
-    <w:p>
-      <w:pPr>
-        <w:pStyle w:val="Heading2"/>
-      </w:pPr>
-      <w:r>
-        <w:t>2.1 ¿Cómo se ingresa a la aplicación móvil?</w:t>
+        <w:t>2. Guía Ilustrada para Técnicos de Campo</w:t>
       </w:r>
     </w:p>
     <w:p>
       <w:r>
-        <w:t>1. Descargue la aplicación gratuita AppSheet desde Google Play Store (Android) o App Store (iOS).</w:t>
-        <w:br/>
-        <w:t>2. Al abrir la app, seleccione la opción 'Sign in with Microsoft' e ingrese su correo corporativo M365 (ej: santiago.moreno@transversaldelsisga.com).</w:t>
-        <w:br/>
-        <w:t>3. El servidor evaluará su SedeID y descargará a su teléfono únicamente los activos y OTs pertenecientes a su zona (ej. Sutatenza, Peaje Machetá, Peaje SLG).</w:t>
-      </w:r>
-    </w:p>
-    <w:p>
-      <w:r>
-        <w:drawing>
-          <wp:inline xmlns:a="http://schemas.openxmlformats.org/drawingml/2006/main" xmlns:pic="http://schemas.openxmlformats.org/drawingml/2006/picture">
-            <wp:extent cx="5486400" cy="3017520"/>
-            <wp:docPr id="2" name="Picture 2"/>
-            <wp:cNvGraphicFramePr>
-              <a:graphicFrameLocks noChangeAspect="1"/>
-            </wp:cNvGraphicFramePr>
-            <a:graphic>
-              <a:graphicData uri="http://schemas.openxmlformats.org/drawingml/2006/picture">
-                <pic:pic>
-                  <pic:nvPicPr>
-                    <pic:cNvPr id="0" name="img_02_login_sso.png"/>
-                    <pic:cNvPicPr/>
-                  </pic:nvPicPr>
-                  <pic:blipFill>
-                    <a:blip r:embed="rId10"/>
-                    <a:stretch>
-                      <a:fillRect/>
-                    </a:stretch>
-                  </pic:blipFill>
-                  <pic:spPr>
-                    <a:xfrm>
-                      <a:off x="0" y="0"/>
-                      <a:ext cx="5486400" cy="3017520"/>
-                    </a:xfrm>
-                    <a:prstGeom prst="rect"/>
-                  </pic:spPr>
-                </pic:pic>
-              </a:graphicData>
-            </a:graphic>
-          </wp:inline>
-        </w:drawing>
-      </w:r>
-    </w:p>
-    <w:p>
-      <w:pPr>
-        <w:jc w:val="center"/>
-      </w:pPr>
-      <w:r>
-        <w:rPr>
-          <w:i/>
-          <w:sz w:val="18"/>
-        </w:rPr>
-        <w:t>Figura 2: Pantalla Móvil 1 — Autenticación M365 y Descarga por SedeID.</w:t>
-      </w:r>
-    </w:p>
-    <w:p>
-      <w:pPr>
-        <w:pStyle w:val="Heading2"/>
-      </w:pPr>
-      <w:r>
-        <w:t>2.2 ¿Cómo se busca y abre un activo en carretera?</w:t>
-      </w:r>
-    </w:p>
-    <w:p>
-      <w:r>
-        <w:t>1. En la barra inferior, presione el icono flotante 'Escanear QR'.</w:t>
-        <w:br/>
-        <w:t>2. Apunte la cámara de su celular al código QR pegado en la estructura del activo (SOS, CCTV, Báscula).</w:t>
-        <w:br/>
-        <w:t>3. La app abrirá la Ficha del Activo mostrando sus 15 atributos (PR, Calzada, Sentido, Coordenadas y Foto).</w:t>
-        <w:br/>
-        <w:t>4. Presione el botón verde 'Iniciar Mantenimiento'.</w:t>
-      </w:r>
-    </w:p>
-    <w:p>
-      <w:r>
-        <w:drawing>
-          <wp:inline xmlns:a="http://schemas.openxmlformats.org/drawingml/2006/main" xmlns:pic="http://schemas.openxmlformats.org/drawingml/2006/picture">
-            <wp:extent cx="5486400" cy="3291840"/>
-            <wp:docPr id="3" name="Picture 3"/>
-            <wp:cNvGraphicFramePr>
-              <a:graphicFrameLocks noChangeAspect="1"/>
-            </wp:cNvGraphicFramePr>
-            <a:graphic>
-              <a:graphicData uri="http://schemas.openxmlformats.org/drawingml/2006/picture">
-                <pic:pic>
-                  <pic:nvPicPr>
-                    <pic:cNvPr id="0" name="img_03_ficha_activo_qr.png"/>
-                    <pic:cNvPicPr/>
-                  </pic:nvPicPr>
-                  <pic:blipFill>
-                    <a:blip r:embed="rId11"/>
-                    <a:stretch>
-                      <a:fillRect/>
-                    </a:stretch>
-                  </pic:blipFill>
-                  <pic:spPr>
-                    <a:xfrm>
-                      <a:off x="0" y="0"/>
-                      <a:ext cx="5486400" cy="3291840"/>
-                    </a:xfrm>
-                    <a:prstGeom prst="rect"/>
-                  </pic:spPr>
-                </pic:pic>
-              </a:graphicData>
-            </a:graphic>
-          </wp:inline>
-        </w:drawing>
-      </w:r>
-    </w:p>
-    <w:p>
-      <w:pPr>
-        <w:jc w:val="center"/>
-      </w:pPr>
-      <w:r>
-        <w:rPr>
-          <w:i/>
-          <w:sz w:val="18"/>
-        </w:rPr>
-        <w:t>Figura 3: Pantalla Móvil 2 — Escáner QR y Ficha de Activo.</w:t>
-      </w:r>
-    </w:p>
-    <w:p>
-      <w:pPr>
-        <w:pStyle w:val="Heading2"/>
-      </w:pPr>
-      <w:r>
-        <w:t>2.3 ¿Cómo se crea un mantenimiento y se capturan evidencias?</w:t>
-      </w:r>
-    </w:p>
-    <w:p>
-      <w:r>
-        <w:t>1. Al iniciar el mantenimiento, la app cargará automáticamente el checklist específico según el tipo de activo (ej. FRM_SOS para postes SOS, FRM_CCTV para cámaras, etc.).</w:t>
-        <w:br/>
-        <w:t>2. Marque las casillas de inspección (Conforme, No Conforme, No Aplica).</w:t>
-        <w:br/>
-        <w:t>3. Tome hasta 6 fotografías de evidencia (la app aplicará compresión a 600px automáticamente para no agotar sus datos móviles).</w:t>
-        <w:br/>
-        <w:t>4. Dibuje su firma manuscrita digital sobre la pantalla táctil del teléfono.</w:t>
-        <w:br/>
-        <w:t>5. Presione el botón 'Guardar'.</w:t>
-      </w:r>
-    </w:p>
-    <w:p>
-      <w:r>
-        <w:drawing>
-          <wp:inline xmlns:a="http://schemas.openxmlformats.org/drawingml/2006/main" xmlns:pic="http://schemas.openxmlformats.org/drawingml/2006/picture">
-            <wp:extent cx="5486400" cy="3566160"/>
-            <wp:docPr id="4" name="Picture 4"/>
-            <wp:cNvGraphicFramePr>
-              <a:graphicFrameLocks noChangeAspect="1"/>
-            </wp:cNvGraphicFramePr>
-            <a:graphic>
-              <a:graphicData uri="http://schemas.openxmlformats.org/drawingml/2006/picture">
-                <pic:pic>
-                  <pic:nvPicPr>
-                    <pic:cNvPr id="0" name="img_04_checklist_mantenimiento.png"/>
-                    <pic:cNvPicPr/>
-                  </pic:nvPicPr>
-                  <pic:blipFill>
-                    <a:blip r:embed="rId12"/>
-                    <a:stretch>
-                      <a:fillRect/>
-                    </a:stretch>
-                  </pic:blipFill>
-                  <pic:spPr>
-                    <a:xfrm>
-                      <a:off x="0" y="0"/>
-                      <a:ext cx="5486400" cy="3566160"/>
-                    </a:xfrm>
-                    <a:prstGeom prst="rect"/>
-                  </pic:spPr>
-                </pic:pic>
-              </a:graphicData>
-            </a:graphic>
-          </wp:inline>
-        </w:drawing>
-      </w:r>
-    </w:p>
-    <w:p>
-      <w:pPr>
-        <w:jc w:val="center"/>
-      </w:pPr>
-      <w:r>
-        <w:rPr>
-          <w:i/>
-          <w:sz w:val="18"/>
-        </w:rPr>
-        <w:t>Figura 4: Pantalla Móvil 3 — Checklist Dinámico, Fotos y Firma.</w:t>
-      </w:r>
-    </w:p>
-    <w:p>
-      <w:pPr>
-        <w:pStyle w:val="Heading2"/>
-      </w:pPr>
-      <w:r>
-        <w:t>2.4 ¿Cómo funciona la validación GPS de Geofencing?</w:t>
-      </w:r>
-    </w:p>
-    <w:p>
-      <w:r>
-        <w:t>1. Al guardar, AppSheet tomará automáticamente su ubicación actual (HERE()) y la precisión de la señal satelital (USERLOCATIONACCURACY()).</w:t>
-        <w:br/>
-        <w:t>2. Regla de Validación (RF-012): La app calcula la distancia a las coordenadas registradas del activo. Si la distancia es menor o igual a 1.0 km, autoriza el guardado.</w:t>
-        <w:br/>
-        <w:t>3. Si está a más de 1.0 km, la app mostrará una alerta impidiendo el cierre de la orden.</w:t>
+        <w:t>Uso de la aplicación móvil AppSheet, lectura de QR, formularios dinámicos y geofencing GPS:</w:t>
       </w:r>
     </w:p>
     <w:p>
@@ -374,7 +63,7 @@
         <w:drawing>
           <wp:inline xmlns:a="http://schemas.openxmlformats.org/drawingml/2006/main" xmlns:pic="http://schemas.openxmlformats.org/drawingml/2006/picture">
             <wp:extent cx="5486400" cy="3182112"/>
-            <wp:docPr id="5" name="Picture 5"/>
+            <wp:docPr id="1" name="Picture 1"/>
             <wp:cNvGraphicFramePr>
               <a:graphicFrameLocks noChangeAspect="1"/>
             </wp:cNvGraphicFramePr>
@@ -386,7 +75,7 @@
                     <pic:cNvPicPr/>
                   </pic:nvPicPr>
                   <pic:blipFill>
-                    <a:blip r:embed="rId13"/>
+                    <a:blip r:embed="rId9"/>
                     <a:stretch>
                       <a:fillRect/>
                     </a:stretch>
@@ -410,88 +99,7 @@
         <w:jc w:val="center"/>
       </w:pPr>
       <w:r>
-        <w:rPr>
-          <w:i/>
-          <w:sz w:val="18"/>
-        </w:rPr>
-        <w:t>Figura 5: Pantalla Móvil 4 — Geofencing GPS y Protocolo de Túneles.</w:t>
-      </w:r>
-    </w:p>
-    <w:p>
-      <w:pPr>
-        <w:pStyle w:val="Heading1"/>
-      </w:pPr>
-      <w:r>
-        <w:t>3. Guía Ilustrada para Supervisores CCO (Portal Web)</w:t>
-      </w:r>
-    </w:p>
-    <w:p>
-      <w:pPr>
-        <w:pStyle w:val="Heading2"/>
-      </w:pPr>
-      <w:r>
-        <w:t>3.1 ¿Cómo se asigna una OT y cómo se monitorean los KPIs?</w:t>
-      </w:r>
-    </w:p>
-    <w:p>
-      <w:r>
-        <w:t>1. Ingrese desde su computador al portal web de AppSheet.</w:t>
-        <w:br/>
-        <w:t>2. Abra la vista 'Órdenes de Trabajo' y haga clic en '+ Agregar OT'.</w:t>
-        <w:br/>
-        <w:t>3. Seleccione el Activo, el Técnico y la Fecha Programada.</w:t>
-        <w:br/>
-        <w:t>4. El motor de automatización enviará una notificación por correo al técnico de forma inmediata.</w:t>
-        <w:br/>
-        <w:t>5. Ingrese al 'Tablero KPI' para monitorear los indicadores de cumplimiento y recepción de alertas en PDF ante activos marcados 'Fuera de Servicio'.</w:t>
-      </w:r>
-    </w:p>
-    <w:p>
-      <w:r>
-        <w:drawing>
-          <wp:inline xmlns:a="http://schemas.openxmlformats.org/drawingml/2006/main" xmlns:pic="http://schemas.openxmlformats.org/drawingml/2006/picture">
-            <wp:extent cx="5486400" cy="3291840"/>
-            <wp:docPr id="6" name="Picture 6"/>
-            <wp:cNvGraphicFramePr>
-              <a:graphicFrameLocks noChangeAspect="1"/>
-            </wp:cNvGraphicFramePr>
-            <a:graphic>
-              <a:graphicData uri="http://schemas.openxmlformats.org/drawingml/2006/picture">
-                <pic:pic>
-                  <pic:nvPicPr>
-                    <pic:cNvPr id="0" name="img_06_portal_web_cco.png"/>
-                    <pic:cNvPicPr/>
-                  </pic:nvPicPr>
-                  <pic:blipFill>
-                    <a:blip r:embed="rId14"/>
-                    <a:stretch>
-                      <a:fillRect/>
-                    </a:stretch>
-                  </pic:blipFill>
-                  <pic:spPr>
-                    <a:xfrm>
-                      <a:off x="0" y="0"/>
-                      <a:ext cx="5486400" cy="3291840"/>
-                    </a:xfrm>
-                    <a:prstGeom prst="rect"/>
-                  </pic:spPr>
-                </pic:pic>
-              </a:graphicData>
-            </a:graphic>
-          </wp:inline>
-        </w:drawing>
-      </w:r>
-    </w:p>
-    <w:p>
-      <w:pPr>
-        <w:jc w:val="center"/>
-      </w:pPr>
-      <w:r>
-        <w:rPr>
-          <w:i/>
-          <w:sz w:val="18"/>
-        </w:rPr>
-        <w:t>Figura 6: Portal Web Supervisor CCO — Asignación de OTs y Tablero KPI.</w:t>
+        <w:t>Figura 1: Validación de Geofencing GPS mediante la columna Ubicacion.</w:t>
       </w:r>
     </w:p>
     <w:sectPr>

</xml_diff>